<commit_message>
Asian feature develop 1
</commit_message>
<xml_diff>
--- a/Data Engineer roles and responsibilities.docx
+++ b/Data Engineer roles and responsibilities.docx
@@ -61,15 +61,7 @@
         <w:t>⃣</w:t>
       </w:r>
       <w:r>
-        <w:t xml:space="preserve"> Data </w:t>
-      </w:r>
-      <w:proofErr w:type="gramStart"/>
-      <w:r>
-        <w:t>Sources  →</w:t>
-      </w:r>
-      <w:proofErr w:type="gramEnd"/>
-      <w:r>
-        <w:t xml:space="preserve">  2️</w:t>
+        <w:t xml:space="preserve"> Data Sources  →  2️</w:t>
       </w:r>
       <w:r>
         <w:rPr>
@@ -78,15 +70,7 @@
         <w:t>⃣</w:t>
       </w:r>
       <w:r>
-        <w:t xml:space="preserve"> Data </w:t>
-      </w:r>
-      <w:proofErr w:type="gramStart"/>
-      <w:r>
-        <w:t>Ingestion  →</w:t>
-      </w:r>
-      <w:proofErr w:type="gramEnd"/>
-      <w:r>
-        <w:t xml:space="preserve">  3️</w:t>
+        <w:t xml:space="preserve"> Data Ingestion  →  3️</w:t>
       </w:r>
       <w:r>
         <w:rPr>
@@ -99,13 +83,8 @@
       </w:r>
     </w:p>
     <w:p>
-      <w:proofErr w:type="gramStart"/>
-      <w:r>
-        <w:t>→  4</w:t>
-      </w:r>
-      <w:proofErr w:type="gramEnd"/>
-      <w:r>
-        <w:t>️</w:t>
+      <w:r>
+        <w:t>→  4️</w:t>
       </w:r>
       <w:r>
         <w:rPr>
@@ -114,15 +93,7 @@
         <w:t>⃣</w:t>
       </w:r>
       <w:r>
-        <w:t xml:space="preserve"> Data Modelling &amp; </w:t>
-      </w:r>
-      <w:proofErr w:type="gramStart"/>
-      <w:r>
-        <w:t>Storage  →</w:t>
-      </w:r>
-      <w:proofErr w:type="gramEnd"/>
-      <w:r>
-        <w:t xml:space="preserve">  5️</w:t>
+        <w:t xml:space="preserve"> Data Modelling &amp; Storage  →  5️</w:t>
       </w:r>
       <w:r>
         <w:rPr>
@@ -131,15 +102,7 @@
         <w:t>⃣</w:t>
       </w:r>
       <w:r>
-        <w:t xml:space="preserve"> </w:t>
-      </w:r>
-      <w:proofErr w:type="gramStart"/>
-      <w:r>
-        <w:t>Orchestration  →</w:t>
-      </w:r>
-      <w:proofErr w:type="gramEnd"/>
-      <w:r>
-        <w:t xml:space="preserve">  6️</w:t>
+        <w:t xml:space="preserve"> Orchestration  →  6️</w:t>
       </w:r>
       <w:r>
         <w:rPr>
@@ -148,15 +111,7 @@
         <w:t>⃣</w:t>
       </w:r>
       <w:r>
-        <w:t xml:space="preserve"> Cloud </w:t>
-      </w:r>
-      <w:proofErr w:type="gramStart"/>
-      <w:r>
-        <w:t>Deployment  →</w:t>
-      </w:r>
-      <w:proofErr w:type="gramEnd"/>
-      <w:r>
-        <w:t xml:space="preserve">  7️</w:t>
+        <w:t xml:space="preserve"> Cloud Deployment  →  7️</w:t>
       </w:r>
       <w:r>
         <w:rPr>
@@ -478,7 +433,6 @@
             <w:r>
               <w:t xml:space="preserve">, </w:t>
             </w:r>
-            <w:proofErr w:type="spellStart"/>
             <w:r>
               <w:rPr>
                 <w:b/>
@@ -486,7 +440,6 @@
               </w:rPr>
               <w:t>NiFi</w:t>
             </w:r>
-            <w:proofErr w:type="spellEnd"/>
             <w:r>
               <w:t xml:space="preserve">, </w:t>
             </w:r>
@@ -507,15 +460,7 @@
           </w:tcPr>
           <w:p>
             <w:r>
-              <w:t xml:space="preserve">Kafka for streaming data, Glue or </w:t>
-            </w:r>
-            <w:proofErr w:type="spellStart"/>
-            <w:r>
-              <w:t>NiFi</w:t>
-            </w:r>
-            <w:proofErr w:type="spellEnd"/>
-            <w:r>
-              <w:t xml:space="preserve"> for batch. Python connects APIs or DBs to pull data.</w:t>
+              <w:t>Kafka for streaming data, Glue or NiFi for batch. Python connects APIs or DBs to pull data.</w:t>
             </w:r>
           </w:p>
         </w:tc>
@@ -569,7 +514,6 @@
             <w:r>
               <w:t xml:space="preserve">, </w:t>
             </w:r>
-            <w:proofErr w:type="spellStart"/>
             <w:r>
               <w:rPr>
                 <w:b/>
@@ -577,7 +521,6 @@
               </w:rPr>
               <w:t>PySpark</w:t>
             </w:r>
-            <w:proofErr w:type="spellEnd"/>
             <w:r>
               <w:t xml:space="preserve">, </w:t>
             </w:r>
@@ -628,15 +571,7 @@
           </w:tcPr>
           <w:p>
             <w:r>
-              <w:t>Spark/</w:t>
-            </w:r>
-            <w:proofErr w:type="spellStart"/>
-            <w:r>
-              <w:t>PySpark</w:t>
-            </w:r>
-            <w:proofErr w:type="spellEnd"/>
-            <w:r>
-              <w:t xml:space="preserve"> process huge data; SQL applies logic; Hadoop stores and reads distributed data.</w:t>
+              <w:t>Spark/PySpark process huge data; SQL applies logic; Hadoop stores and reads distributed data.</w:t>
             </w:r>
           </w:p>
         </w:tc>
@@ -710,7 +645,6 @@
             <w:r>
               <w:t xml:space="preserve">, </w:t>
             </w:r>
-            <w:proofErr w:type="spellStart"/>
             <w:r>
               <w:rPr>
                 <w:b/>
@@ -718,7 +652,6 @@
               </w:rPr>
               <w:t>BigQuery</w:t>
             </w:r>
-            <w:proofErr w:type="spellEnd"/>
             <w:r>
               <w:t xml:space="preserve">, </w:t>
             </w:r>
@@ -900,23 +833,7 @@
                 <w:b/>
                 <w:bCs/>
               </w:rPr>
-              <w:t xml:space="preserve">GCP (Dataflow, </w:t>
-            </w:r>
-            <w:proofErr w:type="spellStart"/>
-            <w:r>
-              <w:rPr>
-                <w:b/>
-                <w:bCs/>
-              </w:rPr>
-              <w:t>BigQuery</w:t>
-            </w:r>
-            <w:proofErr w:type="spellEnd"/>
-            <w:r>
-              <w:rPr>
-                <w:b/>
-                <w:bCs/>
-              </w:rPr>
-              <w:t>)</w:t>
+              <w:t>GCP (Dataflow, BigQuery)</w:t>
             </w:r>
           </w:p>
         </w:tc>
@@ -1343,30 +1260,20 @@
             <w:hideMark/>
           </w:tcPr>
           <w:p>
-            <w:proofErr w:type="spellStart"/>
-            <w:r>
-              <w:t>PySpark</w:t>
-            </w:r>
-            <w:proofErr w:type="spellEnd"/>
-            <w:r>
-              <w:t>, SQL</w:t>
-            </w:r>
-          </w:p>
-        </w:tc>
-        <w:tc>
-          <w:tcPr>
-            <w:tcW w:w="0" w:type="auto"/>
-            <w:vAlign w:val="center"/>
-            <w:hideMark/>
-          </w:tcPr>
-          <w:p>
-            <w:proofErr w:type="spellStart"/>
-            <w:r>
-              <w:t>PySpark</w:t>
-            </w:r>
-            <w:proofErr w:type="spellEnd"/>
-            <w:r>
-              <w:t xml:space="preserve"> joins customer &amp; order data</w:t>
+            <w:r>
+              <w:t>PySpark, SQL</w:t>
+            </w:r>
+          </w:p>
+        </w:tc>
+        <w:tc>
+          <w:tcPr>
+            <w:tcW w:w="0" w:type="auto"/>
+            <w:vAlign w:val="center"/>
+            <w:hideMark/>
+          </w:tcPr>
+          <w:p>
+            <w:r>
+              <w:t>PySpark joins customer &amp; order data</w:t>
             </w:r>
           </w:p>
         </w:tc>
@@ -1422,27 +1329,9 @@
             <w:hideMark/>
           </w:tcPr>
           <w:p>
-            <w:proofErr w:type="spellStart"/>
-            <w:r>
-              <w:t>fact_sales</w:t>
-            </w:r>
-            <w:proofErr w:type="spellEnd"/>
-            <w:r>
-              <w:t xml:space="preserve">, </w:t>
-            </w:r>
-            <w:proofErr w:type="spellStart"/>
-            <w:r>
-              <w:t>dim_customer</w:t>
-            </w:r>
-            <w:proofErr w:type="spellEnd"/>
-            <w:r>
-              <w:t xml:space="preserve">, </w:t>
-            </w:r>
-            <w:proofErr w:type="spellStart"/>
-            <w:r>
-              <w:t>dim_product</w:t>
-            </w:r>
-            <w:proofErr w:type="spellEnd"/>
+            <w:r>
+              <w:t>fact_sales, dim_customer, dim_product</w:t>
+            </w:r>
           </w:p>
         </w:tc>
       </w:tr>
@@ -1946,17 +1835,8 @@
                 <w:b/>
                 <w:bCs/>
               </w:rPr>
-              <w:t xml:space="preserve">Spark / </w:t>
-            </w:r>
-            <w:proofErr w:type="spellStart"/>
-            <w:r>
-              <w:rPr>
-                <w:b/>
-                <w:bCs/>
-              </w:rPr>
-              <w:t>PySpark</w:t>
-            </w:r>
-            <w:proofErr w:type="spellEnd"/>
+              <w:t>Spark / PySpark</w:t>
+            </w:r>
           </w:p>
         </w:tc>
         <w:tc>
@@ -2204,15 +2084,7 @@
           </w:tcPr>
           <w:p>
             <w:r>
-              <w:t xml:space="preserve">Spark-based data </w:t>
-            </w:r>
-            <w:proofErr w:type="spellStart"/>
-            <w:r>
-              <w:t>lakehouse</w:t>
-            </w:r>
-            <w:proofErr w:type="spellEnd"/>
-            <w:r>
-              <w:t xml:space="preserve"> platform</w:t>
+              <w:t>Spark-based data lakehouse platform</w:t>
             </w:r>
           </w:p>
         </w:tc>
@@ -2414,15 +2286,7 @@
         <w:t>⬆️</w:t>
       </w:r>
       <w:r>
-        <w:t xml:space="preserve"> Transformation (Spark / </w:t>
-      </w:r>
-      <w:proofErr w:type="spellStart"/>
-      <w:r>
-        <w:t>PySpark</w:t>
-      </w:r>
-      <w:proofErr w:type="spellEnd"/>
-      <w:r>
-        <w:t xml:space="preserve"> / Databricks / Flink)</w:t>
+        <w:t xml:space="preserve"> Transformation (Spark / PySpark / Databricks / Flink)</w:t>
       </w:r>
     </w:p>
     <w:p>
@@ -2433,15 +2297,7 @@
         <w:t>⬆️</w:t>
       </w:r>
       <w:r>
-        <w:t xml:space="preserve"> Ingestion (Kafka / Python / Glue / </w:t>
-      </w:r>
-      <w:proofErr w:type="spellStart"/>
-      <w:r>
-        <w:t>NiFi</w:t>
-      </w:r>
-      <w:proofErr w:type="spellEnd"/>
-      <w:r>
-        <w:t>)</w:t>
+        <w:t xml:space="preserve"> Ingestion (Kafka / Python / Glue / NiFi)</w:t>
       </w:r>
     </w:p>
     <w:p>
@@ -2520,15 +2376,7 @@
     </w:p>
     <w:p>
       <w:r>
-        <w:t>“In a real-time Data Engineering project, we use tools in a layered approach — starting from ingestion (Kafka, Glue) → transformation (Spark/</w:t>
-      </w:r>
-      <w:proofErr w:type="spellStart"/>
-      <w:r>
-        <w:t>PySpark</w:t>
-      </w:r>
-      <w:proofErr w:type="spellEnd"/>
-      <w:r>
-        <w:t>) → data modelling (DBT, SQL, Snowflake) → orchestration (Airflow) → deployment (AWS/Azure/GCP).</w:t>
+        <w:t>“In a real-time Data Engineering project, we use tools in a layered approach — starting from ingestion (Kafka, Glue) → transformation (Spark/PySpark) → data modelling (DBT, SQL, Snowflake) → orchestration (Airflow) → deployment (AWS/Azure/GCP).</w:t>
       </w:r>
       <w:r>
         <w:br/>
@@ -2909,13 +2757,8 @@
           </w:tcPr>
           <w:p>
             <w:r>
-              <w:t xml:space="preserve">Jira, Confluence, </w:t>
-            </w:r>
-            <w:proofErr w:type="spellStart"/>
-            <w:r>
-              <w:t>Lucidchart</w:t>
-            </w:r>
-            <w:proofErr w:type="spellEnd"/>
+              <w:t>Jira, Confluence, Lucidchart</w:t>
+            </w:r>
           </w:p>
         </w:tc>
         <w:tc>
@@ -3007,23 +2850,7 @@
           </w:tcPr>
           <w:p>
             <w:r>
-              <w:t xml:space="preserve">Kafka, AWS Glue, </w:t>
-            </w:r>
-            <w:proofErr w:type="spellStart"/>
-            <w:r>
-              <w:t>Airbyte</w:t>
-            </w:r>
-            <w:proofErr w:type="spellEnd"/>
-            <w:r>
-              <w:t xml:space="preserve">, Apache </w:t>
-            </w:r>
-            <w:proofErr w:type="spellStart"/>
-            <w:r>
-              <w:t>NiFi</w:t>
-            </w:r>
-            <w:proofErr w:type="spellEnd"/>
-            <w:r>
-              <w:t>, Sqoop</w:t>
+              <w:t>Kafka, AWS Glue, Airbyte, Apache NiFi, Sqoop</w:t>
             </w:r>
           </w:p>
         </w:tc>
@@ -3096,13 +2923,8 @@
             <w:hideMark/>
           </w:tcPr>
           <w:p>
-            <w:proofErr w:type="spellStart"/>
-            <w:r>
-              <w:t>PySpark</w:t>
-            </w:r>
-            <w:proofErr w:type="spellEnd"/>
-            <w:r>
-              <w:t>, Databricks, AWS Glue, Flink</w:t>
+            <w:r>
+              <w:t>PySpark, Databricks, AWS Glue, Flink</w:t>
             </w:r>
           </w:p>
         </w:tc>
@@ -3174,13 +2996,8 @@
             <w:hideMark/>
           </w:tcPr>
           <w:p>
-            <w:proofErr w:type="spellStart"/>
-            <w:r>
-              <w:t>dbt</w:t>
-            </w:r>
-            <w:proofErr w:type="spellEnd"/>
-            <w:r>
-              <w:t>, ERD tools, SQL, Snowflake, Redshift</w:t>
+            <w:r>
+              <w:t>dbt, ERD tools, SQL, Snowflake, Redshift</w:t>
             </w:r>
           </w:p>
         </w:tc>
@@ -3241,35 +3058,19 @@
           </w:tcPr>
           <w:p>
             <w:r>
-              <w:t>Load transformed data into a warehouse/</w:t>
-            </w:r>
-            <w:proofErr w:type="spellStart"/>
-            <w:r>
-              <w:t>lakehouse</w:t>
-            </w:r>
-            <w:proofErr w:type="spellEnd"/>
-            <w:r>
-              <w:t>.</w:t>
-            </w:r>
-          </w:p>
-        </w:tc>
-        <w:tc>
-          <w:tcPr>
-            <w:tcW w:w="0" w:type="auto"/>
-            <w:vAlign w:val="center"/>
-            <w:hideMark/>
-          </w:tcPr>
-          <w:p>
-            <w:r>
-              <w:t xml:space="preserve">Snowflake, </w:t>
-            </w:r>
-            <w:proofErr w:type="spellStart"/>
-            <w:r>
-              <w:t>BigQuery</w:t>
-            </w:r>
-            <w:proofErr w:type="spellEnd"/>
-            <w:r>
-              <w:t>, Redshift, Databricks Delta</w:t>
+              <w:t>Load transformed data into a warehouse/lakehouse.</w:t>
+            </w:r>
+          </w:p>
+        </w:tc>
+        <w:tc>
+          <w:tcPr>
+            <w:tcW w:w="0" w:type="auto"/>
+            <w:vAlign w:val="center"/>
+            <w:hideMark/>
+          </w:tcPr>
+          <w:p>
+            <w:r>
+              <w:t>Snowflake, BigQuery, Redshift, Databricks Delta</w:t>
             </w:r>
           </w:p>
         </w:tc>
@@ -3342,23 +3143,7 @@
           </w:tcPr>
           <w:p>
             <w:r>
-              <w:t xml:space="preserve">Airflow, Great Expectations, </w:t>
-            </w:r>
-            <w:proofErr w:type="spellStart"/>
-            <w:r>
-              <w:t>Dagster</w:t>
-            </w:r>
-            <w:proofErr w:type="spellEnd"/>
-            <w:r>
-              <w:t xml:space="preserve">, </w:t>
-            </w:r>
-            <w:proofErr w:type="spellStart"/>
-            <w:r>
-              <w:t>dbt</w:t>
-            </w:r>
-            <w:proofErr w:type="spellEnd"/>
-            <w:r>
-              <w:t xml:space="preserve"> tests</w:t>
+              <w:t>Airflow, Great Expectations, Dagster, dbt tests</w:t>
             </w:r>
           </w:p>
         </w:tc>
@@ -4510,15 +4295,7 @@
           </w:tcPr>
           <w:p>
             <w:r>
-              <w:t xml:space="preserve">Kafka, </w:t>
-            </w:r>
-            <w:proofErr w:type="spellStart"/>
-            <w:r>
-              <w:t>NiFi</w:t>
-            </w:r>
-            <w:proofErr w:type="spellEnd"/>
-            <w:r>
-              <w:t>, AWS Glue, Python scripts</w:t>
+              <w:t>Kafka, NiFi, AWS Glue, Python scripts</w:t>
             </w:r>
           </w:p>
         </w:tc>
@@ -4546,13 +4323,8 @@
             <w:hideMark/>
           </w:tcPr>
           <w:p>
-            <w:proofErr w:type="spellStart"/>
-            <w:r>
-              <w:t>PySpark</w:t>
-            </w:r>
-            <w:proofErr w:type="spellEnd"/>
-            <w:r>
-              <w:t>, Spark, Flink</w:t>
+            <w:r>
+              <w:t>PySpark, Spark, Flink</w:t>
             </w:r>
           </w:p>
         </w:tc>
@@ -4610,13 +4382,8 @@
             <w:hideMark/>
           </w:tcPr>
           <w:p>
-            <w:proofErr w:type="spellStart"/>
-            <w:r>
-              <w:t>dbt</w:t>
-            </w:r>
-            <w:proofErr w:type="spellEnd"/>
-            <w:r>
-              <w:t>, SQL, ERD tools</w:t>
+            <w:r>
+              <w:t>dbt, SQL, ERD tools</w:t>
             </w:r>
           </w:p>
         </w:tc>
@@ -4674,13 +4441,8 @@
           </w:tcPr>
           <w:p>
             <w:r>
-              <w:t xml:space="preserve">Snowflake, Redshift, </w:t>
-            </w:r>
-            <w:proofErr w:type="spellStart"/>
-            <w:r>
-              <w:t>BigQuery</w:t>
-            </w:r>
-            <w:proofErr w:type="spellEnd"/>
+              <w:t>Snowflake, Redshift, BigQuery</w:t>
+            </w:r>
           </w:p>
         </w:tc>
       </w:tr>
@@ -5256,13 +5018,8 @@
             <w:hideMark/>
           </w:tcPr>
           <w:p>
-            <w:proofErr w:type="spellStart"/>
-            <w:r>
-              <w:t>PySpark</w:t>
-            </w:r>
-            <w:proofErr w:type="spellEnd"/>
-            <w:r>
-              <w:t xml:space="preserve"> + scripting + OOP</w:t>
+            <w:r>
+              <w:t>PySpark + scripting + OOP</w:t>
             </w:r>
           </w:p>
         </w:tc>
@@ -5385,13 +5142,8 @@
           </w:tcPr>
           <w:p>
             <w:r>
-              <w:t xml:space="preserve">Hands-on in S3, Redshift, Glue, </w:t>
-            </w:r>
-            <w:proofErr w:type="spellStart"/>
-            <w:r>
-              <w:t>BigQuery</w:t>
-            </w:r>
-            <w:proofErr w:type="spellEnd"/>
+              <w:t>Hands-on in S3, Redshift, Glue, BigQuery</w:t>
+            </w:r>
           </w:p>
         </w:tc>
       </w:tr>
@@ -6518,17 +6270,8 @@
                 <w:b/>
                 <w:bCs/>
               </w:rPr>
-              <w:t xml:space="preserve">Apache Spark / </w:t>
-            </w:r>
-            <w:proofErr w:type="spellStart"/>
-            <w:r>
-              <w:rPr>
-                <w:b/>
-                <w:bCs/>
-              </w:rPr>
-              <w:t>PySpark</w:t>
-            </w:r>
-            <w:proofErr w:type="spellEnd"/>
+              <w:t>Apache Spark / PySpark</w:t>
+            </w:r>
           </w:p>
         </w:tc>
         <w:tc>
@@ -6741,23 +6484,7 @@
           <w:b/>
           <w:bCs/>
         </w:rPr>
-        <w:t xml:space="preserve">From the data lake, I process and transform the data using tools like </w:t>
-      </w:r>
-      <w:proofErr w:type="spellStart"/>
-      <w:r>
-        <w:rPr>
-          <w:b/>
-          <w:bCs/>
-        </w:rPr>
-        <w:t>PySpark</w:t>
-      </w:r>
-      <w:proofErr w:type="spellEnd"/>
-      <w:r>
-        <w:rPr>
-          <w:b/>
-          <w:bCs/>
-        </w:rPr>
-        <w:t>. This includes data cleaning, schema validation, deduplication, handling incremental loads, and converting the data into optimized columnar formats like Parquet.</w:t>
+        <w:t>From the data lake, I process and transform the data using tools like PySpark. This includes data cleaning, schema validation, deduplication, handling incremental loads, and converting the data into optimized columnar formats like Parquet.</w:t>
       </w:r>
     </w:p>
     <w:p>
@@ -6886,7 +6613,7 @@
           <w:bCs/>
         </w:rPr>
         <w:pict w14:anchorId="5136DA91">
-          <v:rect id="_x0000_i1187" style="width:0;height:1.5pt" o:hralign="center" o:hrstd="t" o:hr="t" fillcolor="#a0a0a0" stroked="f"/>
+          <v:rect id="_x0000_i1031" style="width:0;height:1.5pt" o:hralign="center" o:hrstd="t" o:hr="t" fillcolor="#a0a0a0" stroked="f"/>
         </w:pict>
       </w:r>
     </w:p>
@@ -7004,21 +6731,12 @@
           <w:bCs/>
         </w:rPr>
       </w:pPr>
-      <w:proofErr w:type="gramStart"/>
-      <w:r>
-        <w:rPr>
-          <w:b/>
-          <w:bCs/>
-        </w:rPr>
-        <w:t>So</w:t>
-      </w:r>
-      <w:proofErr w:type="gramEnd"/>
-      <w:r>
-        <w:rPr>
-          <w:b/>
-          <w:bCs/>
-        </w:rPr>
-        <w:t xml:space="preserve"> schedulers coordinate the entire data pipeline.</w:t>
+      <w:r>
+        <w:rPr>
+          <w:b/>
+          <w:bCs/>
+        </w:rPr>
+        <w:t>So schedulers coordinate the entire data pipeline.</w:t>
       </w:r>
     </w:p>
     <w:p>
@@ -7034,7 +6752,7 @@
           <w:bCs/>
         </w:rPr>
         <w:pict w14:anchorId="406BD1E7">
-          <v:rect id="_x0000_i1188" style="width:0;height:1.5pt" o:hralign="center" o:hrstd="t" o:hr="t" fillcolor="#a0a0a0" stroked="f"/>
+          <v:rect id="_x0000_i1032" style="width:0;height:1.5pt" o:hralign="center" o:hrstd="t" o:hr="t" fillcolor="#a0a0a0" stroked="f"/>
         </w:pict>
       </w:r>
     </w:p>
@@ -7195,7 +6913,7 @@
           <w:bCs/>
         </w:rPr>
         <w:pict w14:anchorId="036073F9">
-          <v:rect id="_x0000_i1189" style="width:0;height:1.5pt" o:hralign="center" o:hrstd="t" o:hr="t" fillcolor="#a0a0a0" stroked="f"/>
+          <v:rect id="_x0000_i1033" style="width:0;height:1.5pt" o:hralign="center" o:hrstd="t" o:hr="t" fillcolor="#a0a0a0" stroked="f"/>
         </w:pict>
       </w:r>
     </w:p>
@@ -7363,7 +7081,7 @@
           <w:bCs/>
         </w:rPr>
         <w:pict w14:anchorId="264DBDE6">
-          <v:rect id="_x0000_i1190" style="width:0;height:1.5pt" o:hralign="center" o:hrstd="t" o:hr="t" fillcolor="#a0a0a0" stroked="f"/>
+          <v:rect id="_x0000_i1034" style="width:0;height:1.5pt" o:hralign="center" o:hrstd="t" o:hr="t" fillcolor="#a0a0a0" stroked="f"/>
         </w:pict>
       </w:r>
     </w:p>
@@ -7464,7 +7182,7 @@
           <w:bCs/>
         </w:rPr>
         <w:pict w14:anchorId="0F7ADB01">
-          <v:rect id="_x0000_i1191" style="width:0;height:1.5pt" o:hralign="center" o:hrstd="t" o:hr="t" fillcolor="#a0a0a0" stroked="f"/>
+          <v:rect id="_x0000_i1035" style="width:0;height:1.5pt" o:hralign="center" o:hrstd="t" o:hr="t" fillcolor="#a0a0a0" stroked="f"/>
         </w:pict>
       </w:r>
     </w:p>
@@ -7598,7 +7316,7 @@
           <w:bCs/>
         </w:rPr>
         <w:pict w14:anchorId="77305C8C">
-          <v:rect id="_x0000_i1192" style="width:0;height:1.5pt" o:hralign="center" o:hrstd="t" o:hr="t" fillcolor="#a0a0a0" stroked="f"/>
+          <v:rect id="_x0000_i1036" style="width:0;height:1.5pt" o:hralign="center" o:hrstd="t" o:hr="t" fillcolor="#a0a0a0" stroked="f"/>
         </w:pict>
       </w:r>
     </w:p>
@@ -7702,7 +7420,7 @@
           <w:bCs/>
         </w:rPr>
         <w:pict w14:anchorId="155B66FD">
-          <v:rect id="_x0000_i1193" style="width:0;height:1.5pt" o:hralign="center" o:hrstd="t" o:hr="t" fillcolor="#a0a0a0" stroked="f"/>
+          <v:rect id="_x0000_i1037" style="width:0;height:1.5pt" o:hralign="center" o:hrstd="t" o:hr="t" fillcolor="#a0a0a0" stroked="f"/>
         </w:pict>
       </w:r>
     </w:p>
@@ -7806,7 +7524,7 @@
           <w:bCs/>
         </w:rPr>
         <w:pict w14:anchorId="6E8AC2C3">
-          <v:rect id="_x0000_i1194" style="width:0;height:1.5pt" o:hralign="center" o:hrstd="t" o:hr="t" fillcolor="#a0a0a0" stroked="f"/>
+          <v:rect id="_x0000_i1038" style="width:0;height:1.5pt" o:hralign="center" o:hrstd="t" o:hr="t" fillcolor="#a0a0a0" stroked="f"/>
         </w:pict>
       </w:r>
     </w:p>
@@ -8009,7 +7727,7 @@
           <w:bCs/>
         </w:rPr>
         <w:pict w14:anchorId="5C5E9E49">
-          <v:rect id="_x0000_i1195" style="width:0;height:1.5pt" o:hralign="center" o:hrstd="t" o:hr="t" fillcolor="#a0a0a0" stroked="f"/>
+          <v:rect id="_x0000_i1039" style="width:0;height:1.5pt" o:hralign="center" o:hrstd="t" o:hr="t" fillcolor="#a0a0a0" stroked="f"/>
         </w:pict>
       </w:r>
     </w:p>
@@ -8094,7 +7812,7 @@
           <w:bCs/>
         </w:rPr>
         <w:pict w14:anchorId="34EB42A4">
-          <v:rect id="_x0000_i1196" style="width:0;height:1.5pt" o:hralign="center" o:hrstd="t" o:hr="t" fillcolor="#a0a0a0" stroked="f"/>
+          <v:rect id="_x0000_i1040" style="width:0;height:1.5pt" o:hralign="center" o:hrstd="t" o:hr="t" fillcolor="#a0a0a0" stroked="f"/>
         </w:pict>
       </w:r>
     </w:p>
@@ -8232,7 +7950,7 @@
           <w:bCs/>
         </w:rPr>
         <w:pict w14:anchorId="40686B8A">
-          <v:rect id="_x0000_i1197" style="width:0;height:1.5pt" o:hralign="center" o:hrstd="t" o:hr="t" fillcolor="#a0a0a0" stroked="f"/>
+          <v:rect id="_x0000_i1041" style="width:0;height:1.5pt" o:hralign="center" o:hrstd="t" o:hr="t" fillcolor="#a0a0a0" stroked="f"/>
         </w:pict>
       </w:r>
     </w:p>
@@ -8279,7 +7997,7 @@
           <w:bCs/>
         </w:rPr>
         <w:pict w14:anchorId="00F25E6F">
-          <v:rect id="_x0000_i1198" style="width:0;height:1.5pt" o:hralign="center" o:hrstd="t" o:hr="t" fillcolor="#a0a0a0" stroked="f"/>
+          <v:rect id="_x0000_i1042" style="width:0;height:1.5pt" o:hralign="center" o:hrstd="t" o:hr="t" fillcolor="#a0a0a0" stroked="f"/>
         </w:pict>
       </w:r>
     </w:p>
@@ -8467,7 +8185,7 @@
           <w:bCs/>
         </w:rPr>
         <w:pict w14:anchorId="6D1D7EDF">
-          <v:rect id="_x0000_i1199" style="width:0;height:1.5pt" o:hralign="center" o:hrstd="t" o:hr="t" fillcolor="#a0a0a0" stroked="f"/>
+          <v:rect id="_x0000_i1043" style="width:0;height:1.5pt" o:hralign="center" o:hrstd="t" o:hr="t" fillcolor="#a0a0a0" stroked="f"/>
         </w:pict>
       </w:r>
     </w:p>
@@ -8575,7 +8293,7 @@
           <w:bCs/>
         </w:rPr>
         <w:pict w14:anchorId="1F9913D8">
-          <v:rect id="_x0000_i1200" style="width:0;height:1.5pt" o:hralign="center" o:hrstd="t" o:hr="t" fillcolor="#a0a0a0" stroked="f"/>
+          <v:rect id="_x0000_i1044" style="width:0;height:1.5pt" o:hralign="center" o:hrstd="t" o:hr="t" fillcolor="#a0a0a0" stroked="f"/>
         </w:pict>
       </w:r>
     </w:p>
@@ -8721,7 +8439,7 @@
           <w:bCs/>
         </w:rPr>
         <w:pict w14:anchorId="4E9B1AF6">
-          <v:rect id="_x0000_i1201" style="width:0;height:1.5pt" o:hralign="center" o:hrstd="t" o:hr="t" fillcolor="#a0a0a0" stroked="f"/>
+          <v:rect id="_x0000_i1045" style="width:0;height:1.5pt" o:hralign="center" o:hrstd="t" o:hr="t" fillcolor="#a0a0a0" stroked="f"/>
         </w:pict>
       </w:r>
     </w:p>
@@ -8769,7 +8487,7 @@
           <w:bCs/>
         </w:rPr>
         <w:pict w14:anchorId="2F6632E0">
-          <v:rect id="_x0000_i1202" style="width:0;height:1.5pt" o:hralign="center" o:hrstd="t" o:hr="t" fillcolor="#a0a0a0" stroked="f"/>
+          <v:rect id="_x0000_i1046" style="width:0;height:1.5pt" o:hralign="center" o:hrstd="t" o:hr="t" fillcolor="#a0a0a0" stroked="f"/>
         </w:pict>
       </w:r>
     </w:p>
@@ -8854,7 +8572,7 @@
           <w:bCs/>
         </w:rPr>
         <w:pict w14:anchorId="7EBA773D">
-          <v:rect id="_x0000_i1203" style="width:0;height:1.5pt" o:hralign="center" o:hrstd="t" o:hr="t" fillcolor="#a0a0a0" stroked="f"/>
+          <v:rect id="_x0000_i1047" style="width:0;height:1.5pt" o:hralign="center" o:hrstd="t" o:hr="t" fillcolor="#a0a0a0" stroked="f"/>
         </w:pict>
       </w:r>
     </w:p>
@@ -8901,7 +8619,7 @@
           <w:bCs/>
         </w:rPr>
         <w:pict w14:anchorId="527D6462">
-          <v:rect id="_x0000_i1204" style="width:0;height:1.5pt" o:hralign="center" o:hrstd="t" o:hr="t" fillcolor="#a0a0a0" stroked="f"/>
+          <v:rect id="_x0000_i1048" style="width:0;height:1.5pt" o:hralign="center" o:hrstd="t" o:hr="t" fillcolor="#a0a0a0" stroked="f"/>
         </w:pict>
       </w:r>
     </w:p>
@@ -8974,23 +8692,7 @@
           <w:b/>
           <w:bCs/>
         </w:rPr>
-        <w:t xml:space="preserve">Explain </w:t>
-      </w:r>
-      <w:proofErr w:type="spellStart"/>
-      <w:r>
-        <w:rPr>
-          <w:b/>
-          <w:bCs/>
-        </w:rPr>
-        <w:t>cron</w:t>
-      </w:r>
-      <w:proofErr w:type="spellEnd"/>
-      <w:r>
-        <w:rPr>
-          <w:b/>
-          <w:bCs/>
-        </w:rPr>
-        <w:t xml:space="preserve"> vs Airflow</w:t>
+        <w:t>Explain cron vs Airflow</w:t>
       </w:r>
     </w:p>
     <w:p>
@@ -9047,23 +8749,7 @@
           <w:b/>
           <w:bCs/>
         </w:rPr>
-        <w:t xml:space="preserve">How it transforms data by themself or predefined code or data engineer transform </w:t>
-      </w:r>
-      <w:proofErr w:type="spellStart"/>
-      <w:r>
-        <w:rPr>
-          <w:b/>
-          <w:bCs/>
-        </w:rPr>
-        <w:t>tha</w:t>
-      </w:r>
-      <w:proofErr w:type="spellEnd"/>
-      <w:r>
-        <w:rPr>
-          <w:b/>
-          <w:bCs/>
-        </w:rPr>
-        <w:t xml:space="preserve"> data while job scheduling</w:t>
+        <w:t>How it transforms data by themself or predefined code or data engineer transform tha data while job scheduling</w:t>
       </w:r>
     </w:p>
     <w:p>
@@ -9208,7 +8894,7 @@
           <w:bCs/>
         </w:rPr>
         <w:pict w14:anchorId="2F80DBF1">
-          <v:rect id="_x0000_i1205" style="width:0;height:1.5pt" o:hralign="center" o:hrstd="t" o:hr="t" fillcolor="#a0a0a0" stroked="f"/>
+          <v:rect id="_x0000_i1049" style="width:0;height:1.5pt" o:hralign="center" o:hrstd="t" o:hr="t" fillcolor="#a0a0a0" stroked="f"/>
         </w:pict>
       </w:r>
     </w:p>
@@ -9455,7 +9141,7 @@
           <w:bCs/>
         </w:rPr>
         <w:pict w14:anchorId="7D828C4E">
-          <v:rect id="_x0000_i1206" style="width:0;height:1.5pt" o:hralign="center" o:hrstd="t" o:hr="t" fillcolor="#a0a0a0" stroked="f"/>
+          <v:rect id="_x0000_i1050" style="width:0;height:1.5pt" o:hralign="center" o:hrstd="t" o:hr="t" fillcolor="#a0a0a0" stroked="f"/>
         </w:pict>
       </w:r>
     </w:p>
@@ -9564,21 +9250,12 @@
           <w:bCs/>
         </w:rPr>
       </w:pPr>
-      <w:proofErr w:type="spellStart"/>
-      <w:r>
-        <w:rPr>
-          <w:b/>
-          <w:bCs/>
-        </w:rPr>
-        <w:t>PySpark</w:t>
-      </w:r>
-      <w:proofErr w:type="spellEnd"/>
-      <w:r>
-        <w:rPr>
-          <w:b/>
-          <w:bCs/>
-        </w:rPr>
-        <w:t xml:space="preserve"> / Spark SQL</w:t>
+      <w:r>
+        <w:rPr>
+          <w:b/>
+          <w:bCs/>
+        </w:rPr>
+        <w:t>PySpark / Spark SQL</w:t>
       </w:r>
     </w:p>
     <w:p>
@@ -9611,21 +9288,12 @@
           <w:bCs/>
         </w:rPr>
       </w:pPr>
-      <w:proofErr w:type="spellStart"/>
-      <w:r>
-        <w:rPr>
-          <w:b/>
-          <w:bCs/>
-        </w:rPr>
-        <w:t>dbt</w:t>
-      </w:r>
-      <w:proofErr w:type="spellEnd"/>
-      <w:r>
-        <w:rPr>
-          <w:b/>
-          <w:bCs/>
-        </w:rPr>
-        <w:t xml:space="preserve"> models</w:t>
+      <w:r>
+        <w:rPr>
+          <w:b/>
+          <w:bCs/>
+        </w:rPr>
+        <w:t>dbt models</w:t>
       </w:r>
     </w:p>
     <w:p>
@@ -9670,104 +9338,38 @@
           <w:b/>
           <w:bCs/>
         </w:rPr>
-        <w:t xml:space="preserve">  </w:t>
-      </w:r>
-      <w:proofErr w:type="spellStart"/>
-      <w:r>
-        <w:rPr>
-          <w:b/>
-          <w:bCs/>
-        </w:rPr>
-        <w:t>order_id</w:t>
-      </w:r>
-      <w:proofErr w:type="spellEnd"/>
-      <w:r>
-        <w:rPr>
-          <w:b/>
-          <w:bCs/>
-        </w:rPr>
-        <w:t>,</w:t>
-      </w:r>
-    </w:p>
-    <w:p>
-      <w:pPr>
-        <w:rPr>
-          <w:b/>
-          <w:bCs/>
-        </w:rPr>
-      </w:pPr>
-      <w:r>
-        <w:rPr>
-          <w:b/>
-          <w:bCs/>
-        </w:rPr>
-        <w:t xml:space="preserve">  </w:t>
-      </w:r>
-      <w:proofErr w:type="spellStart"/>
-      <w:r>
-        <w:rPr>
-          <w:b/>
-          <w:bCs/>
-        </w:rPr>
-        <w:t>customer_id</w:t>
-      </w:r>
-      <w:proofErr w:type="spellEnd"/>
-      <w:r>
-        <w:rPr>
-          <w:b/>
-          <w:bCs/>
-        </w:rPr>
-        <w:t>,</w:t>
-      </w:r>
-    </w:p>
-    <w:p>
-      <w:pPr>
-        <w:rPr>
-          <w:b/>
-          <w:bCs/>
-        </w:rPr>
-      </w:pPr>
-      <w:r>
-        <w:rPr>
-          <w:b/>
-          <w:bCs/>
-        </w:rPr>
-        <w:t xml:space="preserve">  </w:t>
-      </w:r>
-      <w:proofErr w:type="gramStart"/>
-      <w:r>
-        <w:rPr>
-          <w:b/>
-          <w:bCs/>
-        </w:rPr>
-        <w:t>SUM(</w:t>
-      </w:r>
-      <w:proofErr w:type="spellStart"/>
-      <w:proofErr w:type="gramEnd"/>
-      <w:r>
-        <w:rPr>
-          <w:b/>
-          <w:bCs/>
-        </w:rPr>
-        <w:t>order_amount</w:t>
-      </w:r>
-      <w:proofErr w:type="spellEnd"/>
-      <w:r>
-        <w:rPr>
-          <w:b/>
-          <w:bCs/>
-        </w:rPr>
-        <w:t xml:space="preserve">) AS </w:t>
-      </w:r>
-      <w:proofErr w:type="spellStart"/>
-      <w:r>
-        <w:rPr>
-          <w:b/>
-          <w:bCs/>
-        </w:rPr>
-        <w:t>total_amount</w:t>
-      </w:r>
-      <w:proofErr w:type="spellEnd"/>
+        <w:t xml:space="preserve">  order_id,</w:t>
+      </w:r>
+    </w:p>
+    <w:p>
+      <w:pPr>
+        <w:rPr>
+          <w:b/>
+          <w:bCs/>
+        </w:rPr>
+      </w:pPr>
+      <w:r>
+        <w:rPr>
+          <w:b/>
+          <w:bCs/>
+        </w:rPr>
+        <w:t xml:space="preserve">  customer_id,</w:t>
+      </w:r>
+    </w:p>
+    <w:p>
+      <w:pPr>
+        <w:rPr>
+          <w:b/>
+          <w:bCs/>
+        </w:rPr>
+      </w:pPr>
+      <w:r>
+        <w:rPr>
+          <w:b/>
+          <w:bCs/>
+        </w:rPr>
+        <w:t xml:space="preserve">  SUM(order_amount) AS total_amount</w:t>
+      </w:r>
     </w:p>
     <w:p>
       <w:pPr>
@@ -9796,39 +9398,7 @@
           <w:b/>
           <w:bCs/>
         </w:rPr>
-        <w:t xml:space="preserve">GROUP BY </w:t>
-      </w:r>
-      <w:proofErr w:type="spellStart"/>
-      <w:r>
-        <w:rPr>
-          <w:b/>
-          <w:bCs/>
-        </w:rPr>
-        <w:t>order_id</w:t>
-      </w:r>
-      <w:proofErr w:type="spellEnd"/>
-      <w:r>
-        <w:rPr>
-          <w:b/>
-          <w:bCs/>
-        </w:rPr>
-        <w:t xml:space="preserve">, </w:t>
-      </w:r>
-      <w:proofErr w:type="spellStart"/>
-      <w:r>
-        <w:rPr>
-          <w:b/>
-          <w:bCs/>
-        </w:rPr>
-        <w:t>customer_id</w:t>
-      </w:r>
-      <w:proofErr w:type="spellEnd"/>
-      <w:r>
-        <w:rPr>
-          <w:b/>
-          <w:bCs/>
-        </w:rPr>
-        <w:t>;</w:t>
+        <w:t>GROUP BY order_id, customer_id;</w:t>
       </w:r>
     </w:p>
     <w:p>
@@ -9859,7 +9429,7 @@
           <w:bCs/>
         </w:rPr>
         <w:pict w14:anchorId="144D91C9">
-          <v:rect id="_x0000_i1207" style="width:0;height:1.5pt" o:hralign="center" o:hrstd="t" o:hr="t" fillcolor="#a0a0a0" stroked="f"/>
+          <v:rect id="_x0000_i1051" style="width:0;height:1.5pt" o:hralign="center" o:hrstd="t" o:hr="t" fillcolor="#a0a0a0" stroked="f"/>
         </w:pict>
       </w:r>
     </w:p>
@@ -10032,7 +9602,7 @@
           <w:bCs/>
         </w:rPr>
         <w:pict w14:anchorId="7EDE92D3">
-          <v:rect id="_x0000_i1208" style="width:0;height:1.5pt" o:hralign="center" o:hrstd="t" o:hr="t" fillcolor="#a0a0a0" stroked="f"/>
+          <v:rect id="_x0000_i1052" style="width:0;height:1.5pt" o:hralign="center" o:hrstd="t" o:hr="t" fillcolor="#a0a0a0" stroked="f"/>
         </w:pict>
       </w:r>
     </w:p>
@@ -10151,7 +9721,7 @@
           <w:bCs/>
         </w:rPr>
         <w:pict w14:anchorId="3BB39B71">
-          <v:rect id="_x0000_i1209" style="width:0;height:1.5pt" o:hralign="center" o:hrstd="t" o:hr="t" fillcolor="#a0a0a0" stroked="f"/>
+          <v:rect id="_x0000_i1053" style="width:0;height:1.5pt" o:hralign="center" o:hrstd="t" o:hr="t" fillcolor="#a0a0a0" stroked="f"/>
         </w:pict>
       </w:r>
     </w:p>
@@ -10192,86 +9762,27 @@
           <w:bCs/>
         </w:rPr>
       </w:pPr>
-      <w:proofErr w:type="spellStart"/>
-      <w:r>
-        <w:rPr>
-          <w:b/>
-          <w:bCs/>
-        </w:rPr>
-        <w:t>transform_task</w:t>
-      </w:r>
-      <w:proofErr w:type="spellEnd"/>
-      <w:r>
-        <w:rPr>
-          <w:b/>
-          <w:bCs/>
-        </w:rPr>
-        <w:t xml:space="preserve"> = </w:t>
-      </w:r>
-      <w:proofErr w:type="spellStart"/>
-      <w:proofErr w:type="gramStart"/>
-      <w:r>
-        <w:rPr>
-          <w:b/>
-          <w:bCs/>
-        </w:rPr>
-        <w:t>SparkSubmitOperator</w:t>
-      </w:r>
-      <w:proofErr w:type="spellEnd"/>
-      <w:r>
-        <w:rPr>
-          <w:b/>
-          <w:bCs/>
-        </w:rPr>
-        <w:t>(</w:t>
-      </w:r>
-      <w:proofErr w:type="gramEnd"/>
-    </w:p>
-    <w:p>
-      <w:pPr>
-        <w:rPr>
-          <w:b/>
-          <w:bCs/>
-        </w:rPr>
-      </w:pPr>
-      <w:r>
-        <w:rPr>
-          <w:b/>
-          <w:bCs/>
-        </w:rPr>
-        <w:t xml:space="preserve">    </w:t>
-      </w:r>
-      <w:proofErr w:type="spellStart"/>
-      <w:r>
-        <w:rPr>
-          <w:b/>
-          <w:bCs/>
-        </w:rPr>
-        <w:t>task_id</w:t>
-      </w:r>
-      <w:proofErr w:type="spellEnd"/>
-      <w:r>
-        <w:rPr>
-          <w:b/>
-          <w:bCs/>
-        </w:rPr>
-        <w:t>="</w:t>
-      </w:r>
-      <w:proofErr w:type="spellStart"/>
-      <w:r>
-        <w:rPr>
-          <w:b/>
-          <w:bCs/>
-        </w:rPr>
-        <w:t>transform_sales</w:t>
-      </w:r>
-      <w:proofErr w:type="spellEnd"/>
-      <w:r>
-        <w:rPr>
-          <w:b/>
-          <w:bCs/>
-        </w:rPr>
-        <w:t>",</w:t>
+      <w:r>
+        <w:rPr>
+          <w:b/>
+          <w:bCs/>
+        </w:rPr>
+        <w:t>transform_task = SparkSubmitOperator(</w:t>
+      </w:r>
+    </w:p>
+    <w:p>
+      <w:pPr>
+        <w:rPr>
+          <w:b/>
+          <w:bCs/>
+        </w:rPr>
+      </w:pPr>
+      <w:r>
+        <w:rPr>
+          <w:b/>
+          <w:bCs/>
+        </w:rPr>
+        <w:t xml:space="preserve">    task_id="transform_sales",</w:t>
       </w:r>
     </w:p>
     <w:p>
@@ -10378,7 +9889,7 @@
           <w:bCs/>
         </w:rPr>
         <w:pict w14:anchorId="745F2260">
-          <v:rect id="_x0000_i1210" style="width:0;height:1.5pt" o:hralign="center" o:hrstd="t" o:hr="t" fillcolor="#a0a0a0" stroked="f"/>
+          <v:rect id="_x0000_i1054" style="width:0;height:1.5pt" o:hralign="center" o:hrstd="t" o:hr="t" fillcolor="#a0a0a0" stroked="f"/>
         </w:pict>
       </w:r>
     </w:p>
@@ -10404,147 +9915,43 @@
           <w:bCs/>
         </w:rPr>
       </w:pPr>
-      <w:proofErr w:type="spellStart"/>
-      <w:r>
-        <w:rPr>
-          <w:b/>
-          <w:bCs/>
-        </w:rPr>
-        <w:t>df</w:t>
-      </w:r>
-      <w:proofErr w:type="spellEnd"/>
-      <w:r>
-        <w:rPr>
-          <w:b/>
-          <w:bCs/>
-        </w:rPr>
-        <w:t xml:space="preserve"> = </w:t>
-      </w:r>
-      <w:proofErr w:type="spellStart"/>
-      <w:proofErr w:type="gramStart"/>
-      <w:r>
-        <w:rPr>
-          <w:b/>
-          <w:bCs/>
-        </w:rPr>
-        <w:t>spark.read</w:t>
-      </w:r>
-      <w:proofErr w:type="gramEnd"/>
-      <w:r>
-        <w:rPr>
-          <w:b/>
-          <w:bCs/>
-        </w:rPr>
-        <w:t>.parquet</w:t>
-      </w:r>
-      <w:proofErr w:type="spellEnd"/>
-      <w:r>
-        <w:rPr>
-          <w:b/>
-          <w:bCs/>
-        </w:rPr>
-        <w:t>("s3://raw/orders/")</w:t>
-      </w:r>
-    </w:p>
-    <w:p>
-      <w:pPr>
-        <w:rPr>
-          <w:b/>
-          <w:bCs/>
-        </w:rPr>
-      </w:pPr>
-      <w:proofErr w:type="spellStart"/>
-      <w:r>
-        <w:rPr>
-          <w:b/>
-          <w:bCs/>
-        </w:rPr>
-        <w:t>df_clean</w:t>
-      </w:r>
-      <w:proofErr w:type="spellEnd"/>
-      <w:r>
-        <w:rPr>
-          <w:b/>
-          <w:bCs/>
-        </w:rPr>
-        <w:t xml:space="preserve"> = </w:t>
-      </w:r>
-      <w:proofErr w:type="spellStart"/>
-      <w:proofErr w:type="gramStart"/>
-      <w:r>
-        <w:rPr>
-          <w:b/>
-          <w:bCs/>
-        </w:rPr>
-        <w:t>df.filter</w:t>
-      </w:r>
-      <w:proofErr w:type="spellEnd"/>
-      <w:proofErr w:type="gramEnd"/>
-      <w:r>
-        <w:rPr>
-          <w:b/>
-          <w:bCs/>
-        </w:rPr>
-        <w:t>(</w:t>
-      </w:r>
-      <w:proofErr w:type="spellStart"/>
-      <w:proofErr w:type="gramStart"/>
-      <w:r>
-        <w:rPr>
-          <w:b/>
-          <w:bCs/>
-        </w:rPr>
-        <w:t>df.amount</w:t>
-      </w:r>
-      <w:proofErr w:type="spellEnd"/>
-      <w:proofErr w:type="gramEnd"/>
-      <w:r>
-        <w:rPr>
-          <w:b/>
-          <w:bCs/>
-        </w:rPr>
-        <w:t xml:space="preserve"> &gt; 0)</w:t>
-      </w:r>
-    </w:p>
-    <w:p>
-      <w:pPr>
-        <w:rPr>
-          <w:b/>
-          <w:bCs/>
-        </w:rPr>
-      </w:pPr>
-      <w:proofErr w:type="spellStart"/>
+      <w:r>
+        <w:rPr>
+          <w:b/>
+          <w:bCs/>
+        </w:rPr>
+        <w:t>df = spark.read.parquet("s3://raw/orders/")</w:t>
+      </w:r>
+    </w:p>
+    <w:p>
+      <w:pPr>
+        <w:rPr>
+          <w:b/>
+          <w:bCs/>
+        </w:rPr>
+      </w:pPr>
+      <w:r>
+        <w:rPr>
+          <w:b/>
+          <w:bCs/>
+        </w:rPr>
+        <w:t>df_clean = df.filter(df.amount &gt; 0)</w:t>
+      </w:r>
+    </w:p>
+    <w:p>
+      <w:pPr>
+        <w:rPr>
+          <w:b/>
+          <w:bCs/>
+        </w:rPr>
+      </w:pPr>
       <w:r>
         <w:rPr>
           <w:b/>
           <w:bCs/>
         </w:rPr>
         <w:lastRenderedPageBreak/>
-        <w:t>df_</w:t>
-      </w:r>
-      <w:proofErr w:type="gramStart"/>
-      <w:r>
-        <w:rPr>
-          <w:b/>
-          <w:bCs/>
-        </w:rPr>
-        <w:t>clean.write</w:t>
-      </w:r>
-      <w:proofErr w:type="gramEnd"/>
-      <w:r>
-        <w:rPr>
-          <w:b/>
-          <w:bCs/>
-        </w:rPr>
-        <w:t>.parquet</w:t>
-      </w:r>
-      <w:proofErr w:type="spellEnd"/>
-      <w:r>
-        <w:rPr>
-          <w:b/>
-          <w:bCs/>
-        </w:rPr>
-        <w:t>("s3://processed/orders/")</w:t>
+        <w:t>df_clean.write.parquet("s3://processed/orders/")</w:t>
       </w:r>
     </w:p>
     <w:p>
@@ -10583,7 +9990,7 @@
           <w:bCs/>
         </w:rPr>
         <w:pict w14:anchorId="00B6C566">
-          <v:rect id="_x0000_i1211" style="width:0;height:1.5pt" o:hralign="center" o:hrstd="t" o:hr="t" fillcolor="#a0a0a0" stroked="f"/>
+          <v:rect id="_x0000_i1055" style="width:0;height:1.5pt" o:hralign="center" o:hrstd="t" o:hr="t" fillcolor="#a0a0a0" stroked="f"/>
         </w:pict>
       </w:r>
     </w:p>
@@ -10710,7 +10117,7 @@
           <w:bCs/>
         </w:rPr>
         <w:pict w14:anchorId="7EBF8BBB">
-          <v:rect id="_x0000_i1212" style="width:0;height:1.5pt" o:hralign="center" o:hrstd="t" o:hr="t" fillcolor="#a0a0a0" stroked="f"/>
+          <v:rect id="_x0000_i1056" style="width:0;height:1.5pt" o:hralign="center" o:hrstd="t" o:hr="t" fillcolor="#a0a0a0" stroked="f"/>
         </w:pict>
       </w:r>
     </w:p>
@@ -10810,6 +10217,29 @@
           <w:bCs/>
         </w:rPr>
         <w:t>If logic changes → engineer updates code</w:t>
+      </w:r>
+    </w:p>
+    <w:p>
+      <w:pPr>
+        <w:rPr>
+          <w:b/>
+          <w:bCs/>
+        </w:rPr>
+      </w:pPr>
+    </w:p>
+    <w:p>
+      <w:pPr>
+        <w:rPr>
+          <w:b/>
+          <w:bCs/>
+        </w:rPr>
+      </w:pPr>
+      <w:r>
+        <w:rPr>
+          <w:b/>
+          <w:bCs/>
+        </w:rPr>
+        <w:t>Brach Development update</w:t>
       </w:r>
     </w:p>
     <w:p>
@@ -15049,6 +14479,7 @@
   <w:style w:type="character" w:default="1" w:styleId="DefaultParagraphFont">
     <w:name w:val="Default Paragraph Font"/>
     <w:uiPriority w:val="1"/>
+    <w:semiHidden/>
     <w:unhideWhenUsed/>
   </w:style>
   <w:style w:type="table" w:default="1" w:styleId="TableNormal">

</xml_diff>

<commit_message>
Development changes in featuress branch
</commit_message>
<xml_diff>
--- a/Data Engineer roles and responsibilities.docx
+++ b/Data Engineer roles and responsibilities.docx
@@ -10240,6 +10240,29 @@
           <w:bCs/>
         </w:rPr>
         <w:t>Brach Development update</w:t>
+      </w:r>
+    </w:p>
+    <w:p>
+      <w:pPr>
+        <w:rPr>
+          <w:b/>
+          <w:bCs/>
+        </w:rPr>
+      </w:pPr>
+    </w:p>
+    <w:p>
+      <w:pPr>
+        <w:rPr>
+          <w:b/>
+          <w:bCs/>
+        </w:rPr>
+      </w:pPr>
+      <w:r>
+        <w:rPr>
+          <w:b/>
+          <w:bCs/>
+        </w:rPr>
+        <w:t>Feature Development 2</w:t>
       </w:r>
     </w:p>
     <w:p>

</xml_diff>